<commit_message>
Translate brand kit to Spanish, reorder sections, add new templates
- Translate all brand kit page text to Spanish
- Reorder: Logo Downloads, Document Templates, Colors, Typography, Excel
- Add fancy letterhead variant, Excel templates, and preview thumbnails

Co-Authored-By: Claude Opus 4.6 <noreply@anthropic.com>
</commit_message>
<xml_diff>
--- a/templates/ASPMG-Letterhead.docx
+++ b/templates/ASPMG-Letterhead.docx
@@ -2,384 +2,147 @@
 <file path=word/document.xml><?xml version="1.0" encoding="utf-8"?>
 <w:document xmlns:wpc="http://schemas.microsoft.com/office/word/2010/wordprocessingCanvas" xmlns:mo="http://schemas.microsoft.com/office/mac/office/2008/main" xmlns:mc="http://schemas.openxmlformats.org/markup-compatibility/2006" xmlns:mv="urn:schemas-microsoft-com:mac:vml" xmlns:o="urn:schemas-microsoft-com:office:office" xmlns:r="http://schemas.openxmlformats.org/officeDocument/2006/relationships" xmlns:m="http://schemas.openxmlformats.org/officeDocument/2006/math" xmlns:v="urn:schemas-microsoft-com:vml" xmlns:wp14="http://schemas.microsoft.com/office/word/2010/wordprocessingDrawing" xmlns:wp="http://schemas.openxmlformats.org/drawingml/2006/wordprocessingDrawing" xmlns:w10="urn:schemas-microsoft-com:office:word" xmlns:w="http://schemas.openxmlformats.org/wordprocessingml/2006/main" xmlns:w14="http://schemas.microsoft.com/office/word/2010/wordml" xmlns:wpg="http://schemas.microsoft.com/office/word/2010/wordprocessingGroup" xmlns:wpi="http://schemas.microsoft.com/office/word/2010/wordprocessingInk" xmlns:wne="http://schemas.microsoft.com/office/word/2006/wordml" xmlns:wps="http://schemas.microsoft.com/office/word/2010/wordprocessingShape" mc:Ignorable="w14 wp14">
   <w:body>
-    <w:tbl>
-      <w:tblPr>
-        <w:tblW w:type="auto" w:w="0"/>
-        <w:jc w:val="center"/>
-        <w:tblLayout w:type="fixed"/>
-        <w:tblLook w:firstColumn="1" w:firstRow="1" w:lastColumn="0" w:lastRow="0" w:noHBand="0" w:noVBand="1" w:val="04A0"/>
-        <w:tblW w:w="5000" w:type="pct"/>
-        <w:tblCellSpacing w:w="0" w:type="dxa"/>
-      </w:tblPr>
-      <w:tblGrid>
-        <w:gridCol w:w="4703"/>
-        <w:gridCol w:w="4703"/>
-      </w:tblGrid>
-      <w:tr>
-        <w:tc>
-          <w:tcPr>
-            <w:tcW w:type="dxa" w:w="6480"/>
-            <w:tcBorders>
-              <w:top w:val="none" w:sz="0" w:space="0" w:color="auto"/>
-              <w:bottom w:val="none" w:sz="0" w:space="0" w:color="auto"/>
-              <w:left w:val="none" w:sz="0" w:space="0" w:color="auto"/>
-              <w:right w:val="none" w:sz="0" w:space="0" w:color="auto"/>
-            </w:tcBorders>
-            <w:shd w:fill="1B2A4A"/>
-            <w:tcMar>
-              <w:top w:w="200" w:type="dxa"/>
-              <w:bottom w:w="200" w:type="dxa"/>
-              <w:left w:w="300" w:type="dxa"/>
-              <w:right w:w="300" w:type="dxa"/>
-            </w:tcMar>
-          </w:tcPr>
-          <w:p>
-            <w:pPr>
-              <w:spacing w:before="0" w:after="0"/>
-              <w:jc w:val="left"/>
-            </w:pPr>
-            <w:r>
-              <w:drawing>
-                <wp:inline xmlns:a="http://schemas.openxmlformats.org/drawingml/2006/main" xmlns:pic="http://schemas.openxmlformats.org/drawingml/2006/picture">
-                  <wp:extent cx="502920" cy="448856"/>
-                  <wp:docPr id="1" name="Picture 1"/>
-                  <wp:cNvGraphicFramePr>
-                    <a:graphicFrameLocks noChangeAspect="1"/>
-                  </wp:cNvGraphicFramePr>
-                  <a:graphic>
-                    <a:graphicData uri="http://schemas.openxmlformats.org/drawingml/2006/picture">
-                      <pic:pic>
-                        <pic:nvPicPr>
-                          <pic:cNvPr id="0" name="logo.png"/>
-                          <pic:cNvPicPr/>
-                        </pic:nvPicPr>
-                        <pic:blipFill>
-                          <a:blip r:embed="rId9"/>
-                          <a:stretch>
-                            <a:fillRect/>
-                          </a:stretch>
-                        </pic:blipFill>
-                        <pic:spPr>
-                          <a:xfrm>
-                            <a:off x="0" y="0"/>
-                            <a:ext cx="502920" cy="448856"/>
-                          </a:xfrm>
-                          <a:prstGeom prst="rect"/>
-                        </pic:spPr>
-                      </pic:pic>
-                    </a:graphicData>
-                  </a:graphic>
-                </wp:inline>
-              </w:drawing>
-            </w:r>
-            <w:r>
-              <w:rPr>
-                <w:b w:val="0"/>
-                <w:color w:val="FFFFFF"/>
-                <w:sz w:val="40"/>
-              </w:rPr>
-              <w:t xml:space="preserve">  ASPMG</w:t>
-            </w:r>
-          </w:p>
-          <w:p>
-            <w:pPr>
-              <w:spacing w:before="40" w:after="0"/>
-              <w:jc w:val="left"/>
-            </w:pPr>
-            <w:r>
-              <w:rPr>
-                <w:b/>
-                <w:color w:val="A89060"/>
-                <w:sz w:val="14"/>
-              </w:rPr>
-              <w:t>A SOLID PROPERTY MANAGEMENT GROUP</w:t>
-            </w:r>
-          </w:p>
-        </w:tc>
-        <w:tc>
-          <w:tcPr>
-            <w:tcW w:type="dxa" w:w="3600"/>
-            <w:tcBorders>
-              <w:top w:val="none" w:sz="0" w:space="0" w:color="auto"/>
-              <w:bottom w:val="none" w:sz="0" w:space="0" w:color="auto"/>
-              <w:left w:val="none" w:sz="0" w:space="0" w:color="auto"/>
-              <w:right w:val="none" w:sz="0" w:space="0" w:color="auto"/>
-            </w:tcBorders>
-            <w:shd w:fill="1B2A4A"/>
-            <w:tcMar>
-              <w:top w:w="200" w:type="dxa"/>
-              <w:bottom w:w="200" w:type="dxa"/>
-              <w:left w:w="300" w:type="dxa"/>
-              <w:right w:w="300" w:type="dxa"/>
-            </w:tcMar>
-          </w:tcPr>
-          <w:p>
-            <w:pPr>
-              <w:spacing w:before="80" w:after="0"/>
-              <w:jc w:val="right"/>
-            </w:pPr>
-            <w:r>
-              <w:rPr>
-                <w:b/>
-                <w:color w:val="A89060"/>
-                <w:sz w:val="16"/>
-              </w:rPr>
-              <w:t xml:space="preserve">Phone </w:t>
-            </w:r>
-            <w:r>
-              <w:rPr>
-                <w:color w:val="FFFFFF"/>
-                <w:sz w:val="16"/>
-              </w:rPr>
-              <w:t>(305) 661-8400</w:t>
-            </w:r>
-            <w:r>
-              <w:rPr>
-                <w:sz w:val="16"/>
-              </w:rPr>
-              <w:br/>
-            </w:r>
-            <w:r>
-              <w:rPr>
-                <w:b/>
-                <w:color w:val="A89060"/>
-                <w:sz w:val="16"/>
-              </w:rPr>
-              <w:t xml:space="preserve">Email </w:t>
-            </w:r>
-            <w:r>
-              <w:rPr>
-                <w:color w:val="FFFFFF"/>
-                <w:sz w:val="16"/>
-              </w:rPr>
-              <w:t>info@aspmg.com</w:t>
-            </w:r>
-            <w:r>
-              <w:rPr>
-                <w:sz w:val="16"/>
-              </w:rPr>
-              <w:br/>
-            </w:r>
-            <w:r>
-              <w:rPr>
-                <w:b/>
-                <w:color w:val="A89060"/>
-                <w:sz w:val="16"/>
-              </w:rPr>
-              <w:t xml:space="preserve">Web </w:t>
-            </w:r>
-            <w:r>
-              <w:rPr>
-                <w:color w:val="FFFFFF"/>
-                <w:sz w:val="16"/>
-              </w:rPr>
-              <w:t>www.aspmg.com</w:t>
-            </w:r>
-          </w:p>
-        </w:tc>
-      </w:tr>
-    </w:tbl>
-    <w:tbl>
-      <w:tblPr>
-        <w:tblW w:type="auto" w:w="0"/>
-        <w:jc w:val="center"/>
-        <w:tblLook w:firstColumn="1" w:firstRow="1" w:lastColumn="0" w:lastRow="0" w:noHBand="0" w:noVBand="1" w:val="04A0"/>
-        <w:tblW w:w="5000" w:type="pct"/>
-      </w:tblPr>
-      <w:tblGrid>
-        <w:gridCol w:w="9406"/>
-      </w:tblGrid>
-      <w:tr>
-        <w:tc>
-          <w:tcPr>
-            <w:tcW w:type="dxa" w:w="9406"/>
-            <w:shd w:fill="A89060"/>
-            <w:tcBorders>
-              <w:top w:val="none" w:sz="0" w:space="0" w:color="auto"/>
-              <w:bottom w:val="none" w:sz="0" w:space="0" w:color="auto"/>
-              <w:left w:val="none" w:sz="0" w:space="0" w:color="auto"/>
-              <w:right w:val="none" w:sz="0" w:space="0" w:color="auto"/>
-            </w:tcBorders>
-            <w:tcMar>
-              <w:top w:w="0" w:type="dxa"/>
-              <w:bottom w:w="0" w:type="dxa"/>
-              <w:left w:w="0" w:type="dxa"/>
-              <w:right w:w="0" w:type="dxa"/>
-            </w:tcMar>
-          </w:tcPr>
-          <w:p>
-            <w:pPr>
-              <w:spacing w:before="0" w:after="0"/>
-            </w:pPr>
-            <w:r>
-              <w:rPr>
-                <w:sz w:val="6"/>
-              </w:rPr>
-            </w:r>
-          </w:p>
-        </w:tc>
-      </w:tr>
-    </w:tbl>
     <w:p>
-      <w:pPr>
-        <w:spacing w:before="160" w:after="0"/>
-      </w:pPr>
-    </w:p>
-    <w:p>
-      <w:pPr>
-        <w:spacing w:before="240" w:after="120"/>
-        <w:jc w:val="left"/>
-      </w:pPr>
       <w:r>
         <w:rPr>
-          <w:b w:val="0"/>
-          <w:color w:val="666666"/>
-          <w:sz w:val="20"/>
+          <w:rFonts w:ascii="Calibri" w:hAnsi="Calibri"/>
+          <w:color w:val="333333"/>
+          <w:sz w:val="22"/>
         </w:rPr>
-        <w:t>March 2, 2026</w:t>
+        <w:t>[Date]</w:t>
       </w:r>
     </w:p>
     <w:p>
-      <w:pPr>
-        <w:spacing w:before="240" w:after="240"/>
-        <w:jc w:val="left"/>
-      </w:pPr>
       <w:r>
         <w:rPr>
-          <w:b w:val="0"/>
-          <w:color w:val="1A1E2C"/>
+          <w:rFonts w:ascii="Calibri" w:hAnsi="Calibri"/>
+          <w:color w:val="333333"/>
           <w:sz w:val="22"/>
         </w:rPr>
         <w:t>[Recipient Name]</w:t>
         <w:br/>
+      </w:r>
+      <w:r>
+        <w:rPr>
+          <w:rFonts w:ascii="Calibri" w:hAnsi="Calibri"/>
+          <w:color w:val="333333"/>
+          <w:sz w:val="22"/>
+        </w:rPr>
         <w:t>[Address Line 1]</w:t>
         <w:br/>
+      </w:r>
+      <w:r>
+        <w:rPr>
+          <w:rFonts w:ascii="Calibri" w:hAnsi="Calibri"/>
+          <w:color w:val="333333"/>
+          <w:sz w:val="22"/>
+        </w:rPr>
         <w:t>[City, State ZIP]</w:t>
+        <w:br/>
       </w:r>
     </w:p>
     <w:p>
-      <w:pPr>
-        <w:spacing w:before="0" w:after="240"/>
-        <w:jc w:val="left"/>
-      </w:pPr>
       <w:r>
         <w:rPr>
-          <w:b w:val="0"/>
+          <w:rFonts w:ascii="Calibri" w:hAnsi="Calibri"/>
+          <w:b/>
           <w:color w:val="1B2A4A"/>
-          <w:sz w:val="26"/>
+          <w:sz w:val="22"/>
         </w:rPr>
         <w:t>Re: [Subject Line]</w:t>
       </w:r>
     </w:p>
-    <w:tbl>
-      <w:tblPr>
-        <w:tblW w:type="auto" w:w="0"/>
-        <w:tblLook w:firstColumn="1" w:firstRow="1" w:lastColumn="0" w:lastRow="0" w:noHBand="0" w:noVBand="1" w:val="04A0"/>
-      </w:tblPr>
-      <w:tblGrid>
-        <w:gridCol w:w="9406"/>
-      </w:tblGrid>
-      <w:tr>
-        <w:tc>
-          <w:tcPr>
-            <w:tcW w:type="dxa" w:w="9406"/>
-            <w:tcBorders>
-              <w:top w:val="none" w:sz="0" w:space="0" w:color="auto"/>
-              <w:bottom w:val="none" w:sz="0" w:space="0" w:color="auto"/>
-              <w:left w:val="none" w:sz="0" w:space="0" w:color="auto"/>
-              <w:right w:val="none" w:sz="0" w:space="0" w:color="auto"/>
-            </w:tcBorders>
-            <w:tcBorders>
-              <w:bottom w:val="single" w:sz="4" w:space="0" w:color="E5E5E5"/>
-            </w:tcBorders>
-          </w:tcPr>
-          <w:p>
-            <w:r>
-              <w:rPr>
-                <w:sz w:val="2"/>
-              </w:rPr>
-            </w:r>
-          </w:p>
-        </w:tc>
-      </w:tr>
-    </w:tbl>
     <w:p>
-      <w:pPr>
-        <w:spacing w:before="240" w:after="200"/>
-        <w:jc w:val="left"/>
-      </w:pPr>
       <w:r>
         <w:rPr>
-          <w:b w:val="0"/>
-          <w:color w:val="1A1E2C"/>
+          <w:rFonts w:ascii="Calibri" w:hAnsi="Calibri"/>
+          <w:color w:val="333333"/>
           <w:sz w:val="22"/>
         </w:rPr>
         <w:t>Dear [Recipient],</w:t>
       </w:r>
     </w:p>
     <w:p>
-      <w:pPr>
-        <w:spacing w:before="0" w:after="200"/>
-        <w:jc w:val="left"/>
-      </w:pPr>
       <w:r>
         <w:rPr>
-          <w:b w:val="0"/>
-          <w:color w:val="1A1E2C"/>
+          <w:rFonts w:ascii="Calibri" w:hAnsi="Calibri"/>
+          <w:color w:val="333333"/>
+          <w:sz w:val="22"/>
+        </w:rPr>
+      </w:r>
+    </w:p>
+    <w:p>
+      <w:r>
+        <w:rPr>
+          <w:rFonts w:ascii="Calibri" w:hAnsi="Calibri"/>
+          <w:color w:val="333333"/>
           <w:sz w:val="22"/>
         </w:rPr>
         <w:t>Lorem ipsum dolor sit amet, consectetur adipiscing elit. Sed do eiusmod tempor incididunt ut labore et dolore magna aliqua. Ut enim ad minim veniam, quis nostrud exercitation ullamco laboris.</w:t>
       </w:r>
     </w:p>
     <w:p>
-      <w:pPr>
-        <w:spacing w:before="0" w:after="200"/>
-        <w:jc w:val="left"/>
-      </w:pPr>
       <w:r>
         <w:rPr>
-          <w:b w:val="0"/>
-          <w:color w:val="1A1E2C"/>
+          <w:rFonts w:ascii="Calibri" w:hAnsi="Calibri"/>
+          <w:color w:val="333333"/>
+          <w:sz w:val="22"/>
+        </w:rPr>
+      </w:r>
+    </w:p>
+    <w:p>
+      <w:r>
+        <w:rPr>
+          <w:rFonts w:ascii="Calibri" w:hAnsi="Calibri"/>
+          <w:color w:val="333333"/>
           <w:sz w:val="22"/>
         </w:rPr>
         <w:t>Duis aute irure dolor in reprehenderit in voluptate velit esse cillum dolore eu fugiat nulla pariatur. Excepteur sint occaecat cupidatat non proident.</w:t>
       </w:r>
     </w:p>
     <w:p>
-      <w:pPr>
-        <w:spacing w:before="0" w:after="200"/>
-        <w:jc w:val="left"/>
-      </w:pPr>
       <w:r>
         <w:rPr>
-          <w:b w:val="0"/>
-          <w:color w:val="1A1E2C"/>
+          <w:rFonts w:ascii="Calibri" w:hAnsi="Calibri"/>
+          <w:color w:val="333333"/>
+          <w:sz w:val="22"/>
+        </w:rPr>
+      </w:r>
+    </w:p>
+    <w:p>
+      <w:r>
+        <w:rPr>
+          <w:rFonts w:ascii="Calibri" w:hAnsi="Calibri"/>
+          <w:color w:val="333333"/>
           <w:sz w:val="22"/>
         </w:rPr>
         <w:t>Please do not hesitate to contact our office at (305) 661-8400 should you have any questions or concerns.</w:t>
       </w:r>
     </w:p>
     <w:p>
-      <w:pPr>
-        <w:spacing w:before="120" w:after="600"/>
-        <w:jc w:val="left"/>
-      </w:pPr>
       <w:r>
         <w:rPr>
-          <w:b w:val="0"/>
-          <w:color w:val="1A1E2C"/>
+          <w:rFonts w:ascii="Calibri" w:hAnsi="Calibri"/>
+          <w:color w:val="333333"/>
+          <w:sz w:val="22"/>
+        </w:rPr>
+      </w:r>
+    </w:p>
+    <w:p>
+      <w:r>
+        <w:rPr>
+          <w:rFonts w:ascii="Calibri" w:hAnsi="Calibri"/>
+          <w:color w:val="333333"/>
           <w:sz w:val="22"/>
         </w:rPr>
         <w:t>Sincerely,</w:t>
       </w:r>
     </w:p>
+    <w:p/>
     <w:p>
-      <w:pPr>
-        <w:spacing w:before="0" w:after="0"/>
-        <w:jc w:val="left"/>
-      </w:pPr>
       <w:r>
         <w:rPr>
+          <w:rFonts w:ascii="Calibri" w:hAnsi="Calibri"/>
           <w:b/>
           <w:color w:val="1B2A4A"/>
           <w:sz w:val="22"/>
@@ -388,93 +151,152 @@
       </w:r>
     </w:p>
     <w:p>
-      <w:pPr>
-        <w:spacing w:before="0" w:after="0"/>
-        <w:jc w:val="left"/>
-      </w:pPr>
       <w:r>
         <w:rPr>
-          <w:b w:val="0"/>
+          <w:rFonts w:ascii="Calibri" w:hAnsi="Calibri"/>
           <w:color w:val="A89060"/>
           <w:sz w:val="20"/>
         </w:rPr>
         <w:t>Property Manager, ASPMG</w:t>
       </w:r>
     </w:p>
-    <w:p/>
-    <w:tbl>
-      <w:tblPr>
-        <w:tblW w:type="auto" w:w="0"/>
-        <w:jc w:val="center"/>
-        <w:tblLook w:firstColumn="1" w:firstRow="1" w:lastColumn="0" w:lastRow="0" w:noHBand="0" w:noVBand="1" w:val="04A0"/>
-      </w:tblPr>
-      <w:tblGrid>
-        <w:gridCol w:w="4703"/>
-        <w:gridCol w:w="4703"/>
-      </w:tblGrid>
-      <w:tr>
-        <w:tc>
-          <w:tcPr>
-            <w:tcW w:type="dxa" w:w="4703"/>
-            <w:tcBorders>
-              <w:top w:val="none" w:sz="0" w:space="0" w:color="auto"/>
-              <w:bottom w:val="none" w:sz="0" w:space="0" w:color="auto"/>
-              <w:left w:val="none" w:sz="0" w:space="0" w:color="auto"/>
-              <w:right w:val="none" w:sz="0" w:space="0" w:color="auto"/>
-            </w:tcBorders>
-            <w:tcBorders>
-              <w:top w:val="single" w:sz="4" w:space="0" w:color="E0E0E0"/>
-            </w:tcBorders>
-          </w:tcPr>
-          <w:p>
-            <w:pPr>
-              <w:jc w:val="left"/>
-            </w:pPr>
-            <w:r>
-              <w:rPr>
-                <w:color w:val="999999"/>
-                <w:sz w:val="15"/>
-              </w:rPr>
-              <w:t>85 Grand Canal Dr, Unit 201, Miami, FL 33144</w:t>
-            </w:r>
-          </w:p>
-        </w:tc>
-        <w:tc>
-          <w:tcPr>
-            <w:tcW w:type="dxa" w:w="4703"/>
-            <w:tcBorders>
-              <w:top w:val="none" w:sz="0" w:space="0" w:color="auto"/>
-              <w:bottom w:val="none" w:sz="0" w:space="0" w:color="auto"/>
-              <w:left w:val="none" w:sz="0" w:space="0" w:color="auto"/>
-              <w:right w:val="none" w:sz="0" w:space="0" w:color="auto"/>
-            </w:tcBorders>
-            <w:tcBorders>
-              <w:top w:val="single" w:sz="4" w:space="0" w:color="E0E0E0"/>
-            </w:tcBorders>
-          </w:tcPr>
-          <w:p>
-            <w:pPr>
-              <w:jc w:val="right"/>
-            </w:pPr>
-            <w:r>
-              <w:rPr>
-                <w:color w:val="999999"/>
-                <w:sz w:val="15"/>
-              </w:rPr>
-              <w:t>aspmg.com  |  (305) 661-8400</w:t>
-            </w:r>
-          </w:p>
-        </w:tc>
-      </w:tr>
-    </w:tbl>
     <w:sectPr>
+      <w:headerReference w:type="default" r:id="rId9"/>
+      <w:footerReference w:type="default" r:id="rId10"/>
       <w:pgSz w:w="12240" w:h="15840"/>
-      <w:pgMar w:top="283" w:right="1417" w:bottom="850" w:left="1417" w:header="720" w:footer="720" w:gutter="0"/>
+      <w:pgMar w:top="850" w:right="1417" w:bottom="850" w:left="1417" w:header="720" w:footer="720" w:gutter="0"/>
       <w:cols w:space="720"/>
       <w:docGrid w:linePitch="360"/>
     </w:sectPr>
   </w:body>
 </w:document>
+</file>
+
+<file path=word/footer1.xml><?xml version="1.0" encoding="utf-8"?>
+<w:ftr xmlns:m="http://schemas.openxmlformats.org/officeDocument/2006/math" xmlns:mc="http://schemas.openxmlformats.org/markup-compatibility/2006" xmlns:mo="http://schemas.microsoft.com/office/mac/office/2008/main" xmlns:mv="urn:schemas-microsoft-com:mac:vml" xmlns:o="urn:schemas-microsoft-com:office:office" xmlns:r="http://schemas.openxmlformats.org/officeDocument/2006/relationships" xmlns:v="urn:schemas-microsoft-com:vml" xmlns:w10="urn:schemas-microsoft-com:office:word" xmlns:w14="http://schemas.microsoft.com/office/word/2010/wordml" xmlns:w="http://schemas.openxmlformats.org/wordprocessingml/2006/main" xmlns:wne="http://schemas.microsoft.com/office/word/2006/wordml" xmlns:wp14="http://schemas.microsoft.com/office/word/2010/wordprocessingDrawing" xmlns:wp="http://schemas.openxmlformats.org/drawingml/2006/wordprocessingDrawing" xmlns:wpc="http://schemas.microsoft.com/office/word/2010/wordprocessingCanvas" xmlns:wpg="http://schemas.microsoft.com/office/word/2010/wordprocessingGroup" xmlns:wpi="http://schemas.microsoft.com/office/word/2010/wordprocessingInk" xmlns:wps="http://schemas.microsoft.com/office/word/2010/wordprocessingShape" mc:Ignorable="w14 wp14">
+  <w:p>
+    <w:pPr>
+      <w:pStyle w:val="Footer"/>
+      <w:pBdr>
+        <w:top w:val="single" w:sz="4" w:space="1" w:color="C0C0C0"/>
+      </w:pBdr>
+    </w:pPr>
+  </w:p>
+  <w:p>
+    <w:pPr>
+      <w:jc w:val="center"/>
+    </w:pPr>
+    <w:r>
+      <w:rPr>
+        <w:rFonts w:ascii="Calibri" w:hAnsi="Calibri"/>
+        <w:b/>
+        <w:color w:val="1B2A4A"/>
+        <w:sz w:val="16"/>
+      </w:rPr>
+      <w:t>ASPMG</w:t>
+    </w:r>
+    <w:r>
+      <w:rPr>
+        <w:rFonts w:ascii="Calibri" w:hAnsi="Calibri"/>
+        <w:color w:val="999999"/>
+        <w:sz w:val="14"/>
+      </w:rPr>
+      <w:t xml:space="preserve">  |  85 Grand Canal Dr, Unit 201, Miami, FL 33144  |  (305) 661-8400  |  aspmg.com</w:t>
+    </w:r>
+  </w:p>
+</w:ftr>
+</file>
+
+<file path=word/header1.xml><?xml version="1.0" encoding="utf-8"?>
+<w:hdr xmlns:m="http://schemas.openxmlformats.org/officeDocument/2006/math" xmlns:mc="http://schemas.openxmlformats.org/markup-compatibility/2006" xmlns:mo="http://schemas.microsoft.com/office/mac/office/2008/main" xmlns:mv="urn:schemas-microsoft-com:mac:vml" xmlns:o="urn:schemas-microsoft-com:office:office" xmlns:r="http://schemas.openxmlformats.org/officeDocument/2006/relationships" xmlns:v="urn:schemas-microsoft-com:vml" xmlns:w10="urn:schemas-microsoft-com:office:word" xmlns:w14="http://schemas.microsoft.com/office/word/2010/wordml" xmlns:w="http://schemas.openxmlformats.org/wordprocessingml/2006/main" xmlns:wne="http://schemas.microsoft.com/office/word/2006/wordml" xmlns:wp14="http://schemas.microsoft.com/office/word/2010/wordprocessingDrawing" xmlns:wp="http://schemas.openxmlformats.org/drawingml/2006/wordprocessingDrawing" xmlns:wpc="http://schemas.microsoft.com/office/word/2010/wordprocessingCanvas" xmlns:wpg="http://schemas.microsoft.com/office/word/2010/wordprocessingGroup" xmlns:wpi="http://schemas.microsoft.com/office/word/2010/wordprocessingInk" xmlns:wps="http://schemas.microsoft.com/office/word/2010/wordprocessingShape" mc:Ignorable="w14 wp14">
+  <w:p>
+    <w:pPr>
+      <w:pStyle w:val="Header"/>
+      <w:jc w:val="center"/>
+    </w:pPr>
+    <w:r>
+      <w:drawing>
+        <wp:inline xmlns:a="http://schemas.openxmlformats.org/drawingml/2006/main" xmlns:pic="http://schemas.openxmlformats.org/drawingml/2006/picture">
+          <wp:extent cx="1097280" cy="979322"/>
+          <wp:docPr id="1" name="Picture 1"/>
+          <wp:cNvGraphicFramePr>
+            <a:graphicFrameLocks noChangeAspect="1"/>
+          </wp:cNvGraphicFramePr>
+          <a:graphic>
+            <a:graphicData uri="http://schemas.openxmlformats.org/drawingml/2006/picture">
+              <pic:pic>
+                <pic:nvPicPr>
+                  <pic:cNvPr id="0" name="logo-web-standard.png"/>
+                  <pic:cNvPicPr/>
+                </pic:nvPicPr>
+                <pic:blipFill>
+                  <a:blip r:embed="rId1"/>
+                  <a:stretch>
+                    <a:fillRect/>
+                  </a:stretch>
+                </pic:blipFill>
+                <pic:spPr>
+                  <a:xfrm>
+                    <a:off x="0" y="0"/>
+                    <a:ext cx="1097280" cy="979322"/>
+                  </a:xfrm>
+                  <a:prstGeom prst="rect"/>
+                </pic:spPr>
+              </pic:pic>
+            </a:graphicData>
+          </a:graphic>
+        </wp:inline>
+      </w:drawing>
+    </w:r>
+  </w:p>
+  <w:p>
+    <w:pPr>
+      <w:jc w:val="center"/>
+    </w:pPr>
+    <w:r>
+      <w:rPr>
+        <w:rFonts w:ascii="Calibri" w:hAnsi="Calibri"/>
+        <w:b/>
+        <w:color w:val="1B2A4A"/>
+        <w:sz w:val="20"/>
+      </w:rPr>
+      <w:t>A SOLID PROPERTY MANAGEMENT GROUP</w:t>
+    </w:r>
+  </w:p>
+  <w:p>
+    <w:pPr>
+      <w:jc w:val="center"/>
+    </w:pPr>
+    <w:r>
+      <w:rPr>
+        <w:rFonts w:ascii="Calibri" w:hAnsi="Calibri"/>
+        <w:color w:val="999999"/>
+        <w:sz w:val="16"/>
+      </w:rPr>
+      <w:t>(305) 661-8400  |  info@aspmg.com  |  aspmg.com</w:t>
+    </w:r>
+  </w:p>
+  <w:p>
+    <w:pPr>
+      <w:jc w:val="center"/>
+    </w:pPr>
+    <w:r>
+      <w:rPr>
+        <w:rFonts w:ascii="Calibri" w:hAnsi="Calibri"/>
+        <w:color w:val="999999"/>
+        <w:sz w:val="16"/>
+      </w:rPr>
+      <w:t>85 Grand Canal Dr, Unit 201, Miami, FL 33144</w:t>
+    </w:r>
+  </w:p>
+  <w:p>
+    <w:pPr>
+      <w:pBdr>
+        <w:bottom w:val="single" w:sz="4" w:space="1" w:color="C0C0C0"/>
+      </w:pBdr>
+    </w:pPr>
+  </w:p>
+</w:hdr>
 </file>
 
 <file path=word/numbering.xml><?xml version="1.0" encoding="utf-8"?>
@@ -840,11 +662,6 @@
     <w:name w:val="Normal"/>
     <w:qFormat/>
     <w:rsid w:val="00FC693F"/>
-    <w:rPr>
-      <w:rFonts w:ascii="Arial" w:hAnsi="Arial"/>
-      <w:color w:val="1A1E2C"/>
-      <w:sz w:val="22"/>
-    </w:rPr>
   </w:style>
   <w:style w:type="paragraph" w:styleId="Header">
     <w:name w:val="header"/>

</xml_diff>